<commit_message>
SSU part seven - SVI SU SREDJENI I GOTOVIgit statusgit status
Change-Id: I8de0f14b814f23ac9ccc4acdff2912145c4fd737
</commit_message>
<xml_diff>
--- a/SSU/Ocenjivanje_Slike.docx
+++ b/SSU/Ocenjivanje_Slike.docx
@@ -754,23 +754,7 @@
                 <w:rFonts w:ascii="Times New Roman" w:eastAsia="Times New Roman" w:hAnsi="Times New Roman" w:cs="Times New Roman"/>
                 <w:szCs w:val="22"/>
               </w:rPr>
-              <w:t xml:space="preserve"> </w:t>
-            </w:r>
-            <w:proofErr w:type="spellStart"/>
-            <w:r>
-              <w:rPr>
-                <w:rFonts w:ascii="Times New Roman" w:eastAsia="Times New Roman" w:hAnsi="Times New Roman" w:cs="Times New Roman"/>
-                <w:szCs w:val="22"/>
-              </w:rPr>
-              <w:t>verzija</w:t>
-            </w:r>
-            <w:proofErr w:type="spellEnd"/>
-            <w:r>
-              <w:rPr>
-                <w:rFonts w:ascii="Times New Roman" w:eastAsia="Times New Roman" w:hAnsi="Times New Roman" w:cs="Times New Roman"/>
-                <w:szCs w:val="22"/>
-              </w:rPr>
-              <w:t xml:space="preserve"> </w:t>
+              <w:t xml:space="preserve"> verzija </w:t>
             </w:r>
           </w:p>
         </w:tc>
@@ -1700,7 +1684,15 @@
                 <w:rFonts w:eastAsiaTheme="majorEastAsia"/>
                 <w:noProof/>
               </w:rPr>
-              <w:t>Scenario popunjavanja ankete</w:t>
+              <w:t xml:space="preserve">Scenario </w:t>
+            </w:r>
+            <w:r>
+              <w:rPr>
+                <w:rStyle w:val="Hyperlink"/>
+                <w:rFonts w:eastAsiaTheme="majorEastAsia"/>
+                <w:noProof/>
+              </w:rPr>
+              <w:t>ocenjivanja slike</w:t>
             </w:r>
             <w:r>
               <w:rPr>
@@ -3960,23 +3952,7 @@
                       <w:rFonts w:ascii="Times New Roman" w:eastAsia="Times New Roman" w:hAnsi="Times New Roman" w:cs="Times New Roman"/>
                       <w:sz w:val="20"/>
                     </w:rPr>
-                    <w:t xml:space="preserve"> </w:t>
-                  </w:r>
-                  <w:proofErr w:type="spellStart"/>
-                  <w:r>
-                    <w:rPr>
-                      <w:rFonts w:ascii="Times New Roman" w:eastAsia="Times New Roman" w:hAnsi="Times New Roman" w:cs="Times New Roman"/>
-                      <w:sz w:val="20"/>
-                    </w:rPr>
-                    <w:t>na</w:t>
-                  </w:r>
-                  <w:proofErr w:type="spellEnd"/>
-                  <w:r>
-                    <w:rPr>
-                      <w:rFonts w:ascii="Times New Roman" w:eastAsia="Times New Roman" w:hAnsi="Times New Roman" w:cs="Times New Roman"/>
-                      <w:sz w:val="20"/>
-                    </w:rPr>
-                    <w:t xml:space="preserve"> </w:t>
+                    <w:t xml:space="preserve"> na </w:t>
                   </w:r>
                   <w:proofErr w:type="spellStart"/>
                   <w:r>
@@ -4393,7 +4369,14 @@
           <w:rFonts w:ascii="Times New Roman" w:eastAsia="Times New Roman" w:hAnsi="Times New Roman" w:cs="Times New Roman"/>
           <w:sz w:val="20"/>
         </w:rPr>
-        <w:t xml:space="preserve">,  od </w:t>
+        <w:t>, od</w:t>
+      </w:r>
+      <w:r>
+        <w:rPr>
+          <w:rFonts w:ascii="Times New Roman" w:eastAsia="Times New Roman" w:hAnsi="Times New Roman" w:cs="Times New Roman"/>
+          <w:sz w:val="20"/>
+        </w:rPr>
+        <w:t xml:space="preserve"> </w:t>
       </w:r>
       <w:r>
         <w:rPr>
@@ -5183,7 +5166,23 @@
           <w:rFonts w:ascii="Times New Roman" w:eastAsia="Times New Roman" w:hAnsi="Times New Roman" w:cs="Times New Roman"/>
           <w:sz w:val="20"/>
         </w:rPr>
-        <w:t xml:space="preserve"> u bazi </w:t>
+        <w:t xml:space="preserve"> u </w:t>
+      </w:r>
+      <w:proofErr w:type="spellStart"/>
+      <w:r>
+        <w:rPr>
+          <w:rFonts w:ascii="Times New Roman" w:eastAsia="Times New Roman" w:hAnsi="Times New Roman" w:cs="Times New Roman"/>
+          <w:sz w:val="20"/>
+        </w:rPr>
+        <w:t>bazi</w:t>
+      </w:r>
+      <w:proofErr w:type="spellEnd"/>
+      <w:r>
+        <w:rPr>
+          <w:rFonts w:ascii="Times New Roman" w:eastAsia="Times New Roman" w:hAnsi="Times New Roman" w:cs="Times New Roman"/>
+          <w:sz w:val="20"/>
+        </w:rPr>
+        <w:t xml:space="preserve"> </w:t>
       </w:r>
       <w:proofErr w:type="spellStart"/>
       <w:r>
@@ -10696,6 +10695,7 @@
   <w:style w:type="character" w:default="1" w:styleId="DefaultParagraphFont">
     <w:name w:val="Default Paragraph Font"/>
     <w:uiPriority w:val="1"/>
+    <w:semiHidden/>
     <w:unhideWhenUsed/>
   </w:style>
   <w:style w:type="table" w:default="1" w:styleId="TableNormal">

</xml_diff>